<commit_message>
fix: corrige cita Blandford/ECLIPSE y elimina referencias huerfanas en TFI
- Blandford et al. (2020) en vez de (2018), con la referencia completa
  correcta (ECLIPSE, NIHR Journals Library) y las dos menciones inline
  actualizadas para consistencia.
- Elimina de SS8 las referencias sin cita inline en el cuerpo: Baretich &
  Davis-Smith (2020), Jamshidi et al. (2015), Taghipour et al. (2011) y
  Decreto 828/2006.
- Reemplaza el parrafo vacio del Abstract (SS1) por un placeholder neutro
  en negro.
- Regenera tfi/TFI_Rayts_Yamila.docx.
</commit_message>
<xml_diff>
--- a/tfi/TFI_Rayts_Yamila.docx
+++ b/tfi/TFI_Rayts_Yamila.docx
@@ -437,6 +437,7 @@
           <w:szCs w:val="24"/>
           <w:rFonts w:ascii="Times New Roman" w:cs="Times New Roman" w:eastAsia="Times New Roman" w:hAnsi="Times New Roman"/>
         </w:rPr>
+        <w:t xml:space="preserve">El resumen en inglés (Abstract) se incorporará al finalizar la ejecución del protocolo, con los resultados cuantitativos de la prueba de concepto.</w:t>
       </w:r>
     </w:p>
     <w:p>
@@ -911,7 +912,7 @@
           <w:szCs w:val="24"/>
           <w:rFonts w:ascii="Times New Roman" w:cs="Times New Roman" w:eastAsia="Times New Roman" w:hAnsi="Times New Roman"/>
         </w:rPr>
-        <w:t xml:space="preserve">Como fuentes de apoyo para caracterizar la carga de bombas de infusión —dato que el informe SATI-Q no releva— se utilizan dos estudios internacionales sobre infusión intravenosa múltiple en cuidados críticos: el estudio observacional ECLIPSE (Blandford et al., 2018), realizado sobre 1.326 pacientes y 2.008 infusiones simultáneas en 16 hospitales del sistema de salud del Reino Unido, que documenta que la infusión múltiple simultánea es la práctica habitual en cuidados críticos; y el estudio de laboratorio de Health Quality Ontario (2014), que describe un escenario de paciente crítico complejo con hasta 11 infusiones continuas simultáneas, tomado como cota superior de referencia. Los parámetros que no pueden derivarse directamente de estas fuentes —el perfil de distribución de bombas por paciente, el tamaño total del parque de equipos y el porcentaje de ocupación de camas— se declaran como supuestos explícitos del modelo, fundamentados en las fuentes citadas y en la experiencia clínica de la autora.</w:t>
+        <w:t xml:space="preserve">Como fuentes de apoyo para caracterizar la carga de bombas de infusión —dato que el informe SATI-Q no releva— se utilizan dos estudios internacionales sobre infusión intravenosa múltiple en cuidados críticos: el estudio observacional ECLIPSE (Blandford et al., 2020), realizado sobre 1.326 pacientes y 2.008 infusiones simultáneas en 16 hospitales del sistema de salud del Reino Unido, que documenta que la infusión múltiple simultánea es la práctica habitual en cuidados críticos; y el estudio de laboratorio de Health Quality Ontario (2014), que describe un escenario de paciente crítico complejo con hasta 11 infusiones continuas simultáneas, tomado como cota superior de referencia. Los parámetros que no pueden derivarse directamente de estas fuentes —el perfil de distribución de bombas por paciente, el tamaño total del parque de equipos y el porcentaje de ocupación de camas— se declaran como supuestos explícitos del modelo, fundamentados en las fuentes citadas y en la experiencia clínica de la autora.</w:t>
       </w:r>
     </w:p>
     <w:tbl>
@@ -1507,7 +1508,7 @@
                 <w:szCs w:val="22"/>
                 <w:rFonts w:ascii="Times New Roman" w:cs="Times New Roman" w:eastAsia="Times New Roman" w:hAnsi="Times New Roman"/>
               </w:rPr>
-              <w:t xml:space="preserve">Supuesto declarado, apoyado en ECLIPSE (Blandford et al., 2018) y HQ Ontario (2014)</w:t>
+              <w:t xml:space="preserve">Supuesto declarado, apoyado en ECLIPSE (Blandford et al., 2020) y HQ Ontario (2014)</w:t>
             </w:r>
           </w:p>
         </w:tc>
@@ -5259,7 +5260,7 @@
           <w:szCs w:val="24"/>
           <w:rFonts w:ascii="Times New Roman" w:cs="Times New Roman" w:eastAsia="Times New Roman" w:hAnsi="Times New Roman"/>
         </w:rPr>
-        <w:t xml:space="preserve">Baretich, M. F., &amp; Davis-Smith, C. (2020). Medical Equipment Management. Association for the Advancement of Medical Instrumentation (AAMI).</w:t>
+        <w:t xml:space="preserve">Blandford, A., Furniss, D., Galal-Edeen, G. H., et al. (2020). Intravenous infusion practices across England and their impact on patient safety (ECLIPSE): a mixed-methods observational study. NIHR Journals Library, Health Services and Delivery Research, 8(7).</w:t>
       </w:r>
     </w:p>
     <w:p>
@@ -5274,7 +5275,7 @@
           <w:szCs w:val="24"/>
           <w:rFonts w:ascii="Times New Roman" w:cs="Times New Roman" w:eastAsia="Times New Roman" w:hAnsi="Times New Roman"/>
         </w:rPr>
-        <w:t xml:space="preserve">Blandford, A., Furniss, D., et al. (2018). Intravenous infusion practices across England and their impact on patient safety (ECLIPSE): a mixed-methods observational study. BMJ Quality &amp; Safety.</w:t>
+        <w:t xml:space="preserve">European Committee for Standardization. (2019). EN 15341:2019. Maintenance — Maintenance Key Performance Indicators. CEN.</w:t>
       </w:r>
     </w:p>
     <w:p>
@@ -5289,7 +5290,7 @@
           <w:szCs w:val="24"/>
           <w:rFonts w:ascii="Times New Roman" w:cs="Times New Roman" w:eastAsia="Times New Roman" w:hAnsi="Times New Roman"/>
         </w:rPr>
-        <w:t xml:space="preserve">European Committee for Standardization. (2019). EN 15341:2019. Maintenance — Maintenance Key Performance Indicators. CEN.</w:t>
+        <w:t xml:space="preserve">Health Quality Ontario. (2014). Multiple Intravenous Infusions Phase 2b: Laboratory Study.</w:t>
       </w:r>
     </w:p>
     <w:p>
@@ -5304,7 +5305,7 @@
           <w:szCs w:val="24"/>
           <w:rFonts w:ascii="Times New Roman" w:cs="Times New Roman" w:eastAsia="Times New Roman" w:hAnsi="Times New Roman"/>
         </w:rPr>
-        <w:t xml:space="preserve">Health Quality Ontario. (2014). Multiple Intravenous Infusions Phase 2b: Laboratory Study.</w:t>
+        <w:t xml:space="preserve">Iadanza, E., Gonnelli, V., Satta, F., &amp; Gherardelli, M. (2019). Evidence-based medical equipment management: a convenient implementation. Medical &amp; Biological Engineering &amp; Computing, 57(10), 2215-2230.</w:t>
       </w:r>
     </w:p>
     <w:p>
@@ -5319,7 +5320,7 @@
           <w:szCs w:val="24"/>
           <w:rFonts w:ascii="Times New Roman" w:cs="Times New Roman" w:eastAsia="Times New Roman" w:hAnsi="Times New Roman"/>
         </w:rPr>
-        <w:t xml:space="preserve">Iadanza, E., Gonnelli, V., Satta, F., &amp; Gherardelli, M. (2019). Evidence-based medical equipment management: a convenient implementation. Medical &amp; Biological Engineering &amp; Computing, 57(10), 2215-2230.</w:t>
+        <w:t xml:space="preserve">Ma, L., Wang, Y., Wang, L., &amp; Wang, X. (2021). Practical Application of QR Code Electronic Manuals in Equipment Management and Training. Frontiers in Surgery, 8, 766006.</w:t>
       </w:r>
     </w:p>
     <w:p>
@@ -5334,7 +5335,7 @@
           <w:szCs w:val="24"/>
           <w:rFonts w:ascii="Times New Roman" w:cs="Times New Roman" w:eastAsia="Times New Roman" w:hAnsi="Times New Roman"/>
         </w:rPr>
-        <w:t xml:space="preserve">Jamshidi, A., Rahimi, S. A., Ait-Kadi, D., &amp; Ruiz, A. (2015). A comprehensive fuzzy risk-based maintenance framework for prioritization of medical devices. Applied Soft Computing, 32, 322-334.</w:t>
+        <w:t xml:space="preserve">Ministerio de Salud de la Provincia de Buenos Aires. (s.f.). Dirección de Fiscalización Sanitaria: habilitación de establecimientos y equipamiento.</w:t>
       </w:r>
     </w:p>
     <w:p>
@@ -5349,7 +5350,7 @@
           <w:szCs w:val="24"/>
           <w:rFonts w:ascii="Times New Roman" w:cs="Times New Roman" w:eastAsia="Times New Roman" w:hAnsi="Times New Roman"/>
         </w:rPr>
-        <w:t xml:space="preserve">Ma, L., Wang, Y., Wang, L., &amp; Wang, X. (2021). Practical Application of QR Code Electronic Manuals in Equipment Management and Training. Frontiers in Surgery, 8, 766006.</w:t>
+        <w:t xml:space="preserve">Ministerio de Salud de la Provincia de Buenos Aires. (s.f.). Sistema de Atención Médica Organizada (SAMO).</w:t>
       </w:r>
     </w:p>
     <w:p>
@@ -5364,7 +5365,7 @@
           <w:szCs w:val="24"/>
           <w:rFonts w:ascii="Times New Roman" w:cs="Times New Roman" w:eastAsia="Times New Roman" w:hAnsi="Times New Roman"/>
         </w:rPr>
-        <w:t xml:space="preserve">Ministerio de Salud de la Provincia de Buenos Aires. (s.f.). Dirección de Fiscalización Sanitaria: habilitación de establecimientos y equipamiento.</w:t>
+        <w:t xml:space="preserve">Organización Mundial de la Salud. (2012). Introducción al programa de mantenimiento de equipos médicos. Serie de documentos técnicos de la OMS sobre dispositivos médicos. Ginebra: OMS.</w:t>
       </w:r>
     </w:p>
     <w:p>
@@ -5379,7 +5380,7 @@
           <w:szCs w:val="24"/>
           <w:rFonts w:ascii="Times New Roman" w:cs="Times New Roman" w:eastAsia="Times New Roman" w:hAnsi="Times New Roman"/>
         </w:rPr>
-        <w:t xml:space="preserve">Ministerio de Salud de la Provincia de Buenos Aires. (s.f.). Sistema de Atención Médica Organizada (SAMO).</w:t>
+        <w:t xml:space="preserve">Pereira, M. T., Silva, I. N. S., Lima, J. F. P., et al. (2023). Precision and reliability study of hospital infusion pumps: a systematic review. BioMedical Engineering OnLine, 22(1), 26.</w:t>
       </w:r>
     </w:p>
     <w:p>
@@ -5394,67 +5395,7 @@
           <w:szCs w:val="24"/>
           <w:rFonts w:ascii="Times New Roman" w:cs="Times New Roman" w:eastAsia="Times New Roman" w:hAnsi="Times New Roman"/>
         </w:rPr>
-        <w:t xml:space="preserve">Organización Mundial de la Salud. (2012). Introducción al programa de mantenimiento de equipos médicos. Serie de documentos técnicos de la OMS sobre dispositivos médicos. Ginebra: OMS.</w:t>
-      </w:r>
-    </w:p>
-    <w:p>
-      <w:pPr>
-        <w:spacing w:line="360" w:after="120"/>
-        <w:ind w:left="360" w:hanging="360"/>
-        <w:jc w:val="left"/>
-      </w:pPr>
-      <w:r>
-        <w:rPr>
-          <w:sz w:val="24"/>
-          <w:szCs w:val="24"/>
-          <w:rFonts w:ascii="Times New Roman" w:cs="Times New Roman" w:eastAsia="Times New Roman" w:hAnsi="Times New Roman"/>
-        </w:rPr>
-        <w:t xml:space="preserve">Pereira, M. T., Silva, I. N. S., Lima, J. F. P., et al. (2023). Precision and reliability study of hospital infusion pumps: a systematic review. BioMedical Engineering OnLine, 22(1), 26.</w:t>
-      </w:r>
-    </w:p>
-    <w:p>
-      <w:pPr>
-        <w:spacing w:line="360" w:after="120"/>
-        <w:ind w:left="360" w:hanging="360"/>
-        <w:jc w:val="left"/>
-      </w:pPr>
-      <w:r>
-        <w:rPr>
-          <w:sz w:val="24"/>
-          <w:szCs w:val="24"/>
-          <w:rFonts w:ascii="Times New Roman" w:cs="Times New Roman" w:eastAsia="Times New Roman" w:hAnsi="Times New Roman"/>
-        </w:rPr>
-        <w:t xml:space="preserve">República Argentina. (2006). Decreto 828/2006. Equipamiento médico hospitalario. Boletín Oficial de la República Argentina.</w:t>
-      </w:r>
-    </w:p>
-    <w:p>
-      <w:pPr>
-        <w:spacing w:line="360" w:after="120"/>
-        <w:ind w:left="360" w:hanging="360"/>
-        <w:jc w:val="left"/>
-      </w:pPr>
-      <w:r>
-        <w:rPr>
-          <w:sz w:val="24"/>
-          <w:szCs w:val="24"/>
-          <w:rFonts w:ascii="Times New Roman" w:cs="Times New Roman" w:eastAsia="Times New Roman" w:hAnsi="Times New Roman"/>
-        </w:rPr>
         <w:t xml:space="preserve">Sociedad Argentina de Terapia Intensiva. (2025). Informe SATI-Q UCI Adultos 2025. Programa SATI-Q. Recuperado de https://archive.org/download/resultado-2025/info2025.pdf</w:t>
-      </w:r>
-    </w:p>
-    <w:p>
-      <w:pPr>
-        <w:spacing w:line="360" w:after="120"/>
-        <w:ind w:left="360" w:hanging="360"/>
-        <w:jc w:val="left"/>
-      </w:pPr>
-      <w:r>
-        <w:rPr>
-          <w:sz w:val="24"/>
-          <w:szCs w:val="24"/>
-          <w:rFonts w:ascii="Times New Roman" w:cs="Times New Roman" w:eastAsia="Times New Roman" w:hAnsi="Times New Roman"/>
-        </w:rPr>
-        <w:t xml:space="preserve">Taghipour, S., Banjevic, D., &amp; Jardine, A. K. (2011). Prioritization of medical equipment for maintenance decisions. Journal of the Operational Research Society, 62(9), 1666-1687.</w:t>
       </w:r>
     </w:p>
     <w:p>

</xml_diff>

<commit_message>
feat: TFI — marcadores en verde de datos a completar + documento generado
Co-Authored-By: Claude Opus 4.7 <noreply@anthropic.com>
</commit_message>
<xml_diff>
--- a/tfi/TFI_Rayts_Yamila.docx
+++ b/tfi/TFI_Rayts_Yamila.docx
@@ -389,11 +389,14 @@
       </w:pPr>
       <w:r>
         <w:rPr>
-          <w:sz w:val="24"/>
-          <w:szCs w:val="24"/>
-          <w:rFonts w:ascii="Times New Roman" w:cs="Times New Roman" w:eastAsia="Times New Roman" w:hAnsi="Times New Roman"/>
-        </w:rPr>
-        <w:t xml:space="preserve">Resultados: [los resultados cuantitativos de la prueba de concepto —tasa de lectura correcta de QR, exactitud de la acumulación de horas, comportamiento ante microcortes de red, latencia de sincronización y disparo correcto de alertas— se incorporan a este resumen al finalizar la ejecución del protocolo descripto en la metodología].</w:t>
+          <w:b/>
+          <w:bCs/>
+          <w:color w:val="008000"/>
+          <w:sz w:val="24"/>
+          <w:szCs w:val="24"/>
+          <w:rFonts w:ascii="Times New Roman" w:cs="Times New Roman" w:eastAsia="Times New Roman" w:hAnsi="Times New Roman"/>
+        </w:rPr>
+        <w:t xml:space="preserve">[COMPLETAR TRAS ETAPAS 2-4 — síntesis cuantitativa: tasa de lectura correcta del QR (X%), exactitud de la acumulación de horas (Y%), comportamiento ante microcortes de red (registros recuperados de N), disparo de alertas (Z/Z casos esperados).]</w:t>
       </w:r>
     </w:p>
     <w:p>
@@ -433,11 +436,14 @@
       </w:pPr>
       <w:r>
         <w:rPr>
-          <w:sz w:val="24"/>
-          <w:szCs w:val="24"/>
-          <w:rFonts w:ascii="Times New Roman" w:cs="Times New Roman" w:eastAsia="Times New Roman" w:hAnsi="Times New Roman"/>
-        </w:rPr>
-        <w:t xml:space="preserve">El resumen en inglés (Abstract) se incorporará al finalizar la ejecución del protocolo, con los resultados cuantitativos de la prueba de concepto.</w:t>
+          <w:b/>
+          <w:bCs/>
+          <w:color w:val="008000"/>
+          <w:sz w:val="24"/>
+          <w:szCs w:val="24"/>
+          <w:rFonts w:ascii="Times New Roman" w:cs="Times New Roman" w:eastAsia="Times New Roman" w:hAnsi="Times New Roman"/>
+        </w:rPr>
+        <w:t xml:space="preserve">[COMPLETAR — traducción al inglés del resumen actualizado, incluyendo cifras de resultados.]</w:t>
       </w:r>
     </w:p>
     <w:p>
@@ -3836,11 +3842,14 @@
       </w:pPr>
       <w:r>
         <w:rPr>
-          <w:sz w:val="24"/>
-          <w:szCs w:val="24"/>
-          <w:rFonts w:ascii="Times New Roman" w:cs="Times New Roman" w:eastAsia="Times New Roman" w:hAnsi="Times New Roman"/>
-        </w:rPr>
-        <w:t xml:space="preserve">[la descripción del prototipo efectivamente construido, las URLs del repositorio y de la aplicación desplegada, y las capturas de pantalla de la vista de escaneo, el detalle de un equipo y el tablero de control se incorporan a este apartado al finalizar el desarrollo].</w:t>
+          <w:b/>
+          <w:bCs/>
+          <w:color w:val="008000"/>
+          <w:sz w:val="24"/>
+          <w:szCs w:val="24"/>
+          <w:rFonts w:ascii="Times New Roman" w:cs="Times New Roman" w:eastAsia="Times New Roman" w:hAnsi="Times New Roman"/>
+        </w:rPr>
+        <w:t xml:space="preserve">[COMPLETAR — URL del repositorio público en GitHub, URL de la app desplegada en Vercel, y capturas de pantalla como Figuras 1-3: (a) pantalla de escaneo con confirmación de acción, (b) detalle de un equipo con horas acumuladas y contraste con horómetro, (c) tablero de control con alertas AMP y vencidos. Las imágenes se incorporan como figuras y no cuentan en la extensión.]</w:t>
       </w:r>
     </w:p>
     <w:p>
@@ -3870,7 +3879,172 @@
           <w:szCs w:val="24"/>
           <w:rFonts w:ascii="Times New Roman" w:cs="Times New Roman" w:eastAsia="Times New Roman" w:hAnsi="Times New Roman"/>
         </w:rPr>
-        <w:t xml:space="preserve">La prueba de concepto se ejecuta conforme al protocolo de cuatro etapas descripto en la metodología (4.4, Fase 5). Los resultados obtenidos para cada etapa, así como la tabla resumen correspondiente, se incorporan a este apartado al finalizar la ejecución del protocolo.</w:t>
+        <w:t xml:space="preserve">La prueba de concepto se ejecuta conforme al protocolo de cuatro etapas descripto en la metodología (4.4, Fase 5). A continuación se presentan los resultados obtenidos en cada etapa.</w:t>
+      </w:r>
+    </w:p>
+    <w:p>
+      <w:pPr>
+        <w:pStyle w:val="Heading3"/>
+        <w:spacing w:before="240" w:after="120"/>
+      </w:pPr>
+      <w:r>
+        <w:rPr>
+          <w:b/>
+          <w:bCs/>
+          <w:sz w:val="28"/>
+          <w:szCs w:val="28"/>
+          <w:rFonts w:ascii="Times New Roman" w:cs="Times New Roman" w:eastAsia="Times New Roman" w:hAnsi="Times New Roman"/>
+        </w:rPr>
+        <w:t xml:space="preserve">Etapa 1 — Montaje de la maqueta física</w:t>
+      </w:r>
+    </w:p>
+    <w:p>
+      <w:pPr>
+        <w:spacing w:line="360" w:after="120"/>
+        <w:jc w:val="both"/>
+      </w:pPr>
+      <w:r>
+        <w:rPr>
+          <w:b/>
+          <w:bCs/>
+          <w:color w:val="008000"/>
+          <w:sz w:val="24"/>
+          <w:szCs w:val="24"/>
+          <w:rFonts w:ascii="Times New Roman" w:cs="Times New Roman" w:eastAsia="Times New Roman" w:hAnsi="Times New Roman"/>
+        </w:rPr>
+        <w:t xml:space="preserve">[COMPLETAR — cantidad de gemelos etiquetados (aprox. 101), formato y tamaño de los QR utilizados (25x25 mm, corrección Q), muestra plastificada (aprox. 20), y observaciones del montaje del panel.]</w:t>
+      </w:r>
+    </w:p>
+    <w:p>
+      <w:pPr>
+        <w:pStyle w:val="Heading3"/>
+        <w:spacing w:before="240" w:after="120"/>
+      </w:pPr>
+      <w:r>
+        <w:rPr>
+          <w:b/>
+          <w:bCs/>
+          <w:sz w:val="28"/>
+          <w:szCs w:val="28"/>
+          <w:rFonts w:ascii="Times New Roman" w:cs="Times New Roman" w:eastAsia="Times New Roman" w:hAnsi="Times New Roman"/>
+        </w:rPr>
+        <w:t xml:space="preserve">Etapa 2 — Protocolo de carga dinámica</w:t>
+      </w:r>
+    </w:p>
+    <w:p>
+      <w:pPr>
+        <w:spacing w:line="360" w:after="120"/>
+        <w:jc w:val="both"/>
+      </w:pPr>
+      <w:r>
+        <w:rPr>
+          <w:b/>
+          <w:bCs/>
+          <w:color w:val="008000"/>
+          <w:sz w:val="24"/>
+          <w:szCs w:val="24"/>
+          <w:rFonts w:ascii="Times New Roman" w:cs="Times New Roman" w:eastAsia="Times New Roman" w:hAnsi="Times New Roman"/>
+        </w:rPr>
+        <w:t xml:space="preserve">[COMPLETAR — total de escaneos ejecutados según el cronograma de 14 días (aprox. 294), duración del protocolo, tasa de lectura correcta del QR (lecturas exitosas / intentos), y observaciones bajo distintas condiciones de luz.]</w:t>
+      </w:r>
+    </w:p>
+    <w:p>
+      <w:pPr>
+        <w:pStyle w:val="Heading3"/>
+        <w:spacing w:before="240" w:after="120"/>
+      </w:pPr>
+      <w:r>
+        <w:rPr>
+          <w:b/>
+          <w:bCs/>
+          <w:sz w:val="28"/>
+          <w:szCs w:val="28"/>
+          <w:rFonts w:ascii="Times New Roman" w:cs="Times New Roman" w:eastAsia="Times New Roman" w:hAnsi="Times New Roman"/>
+        </w:rPr>
+        <w:t xml:space="preserve">Etapa 3 — Infraestructura de red y persistencia</w:t>
+      </w:r>
+    </w:p>
+    <w:p>
+      <w:pPr>
+        <w:spacing w:line="360" w:after="120"/>
+        <w:jc w:val="both"/>
+      </w:pPr>
+      <w:r>
+        <w:rPr>
+          <w:b/>
+          <w:bCs/>
+          <w:color w:val="008000"/>
+          <w:sz w:val="24"/>
+          <w:szCs w:val="24"/>
+          <w:rFonts w:ascii="Times New Roman" w:cs="Times New Roman" w:eastAsia="Times New Roman" w:hAnsi="Times New Roman"/>
+        </w:rPr>
+        <w:t xml:space="preserve">[COMPLETAR — comportamiento ante microcortes de conectividad forzados (registros recuperados de N intentados), latencia de sincronización observada, y exactitud de la acumulación de horas (diferencia entre horas calculadas por el sistema y tiempo real transcurrido).]</w:t>
+      </w:r>
+    </w:p>
+    <w:p>
+      <w:pPr>
+        <w:pStyle w:val="Heading3"/>
+        <w:spacing w:before="240" w:after="120"/>
+      </w:pPr>
+      <w:r>
+        <w:rPr>
+          <w:b/>
+          <w:bCs/>
+          <w:sz w:val="28"/>
+          <w:szCs w:val="28"/>
+          <w:rFonts w:ascii="Times New Roman" w:cs="Times New Roman" w:eastAsia="Times New Roman" w:hAnsi="Times New Roman"/>
+        </w:rPr>
+        <w:t xml:space="preserve">Etapa 4 — Prueba de stress y disparo de alertas</w:t>
+      </w:r>
+    </w:p>
+    <w:p>
+      <w:pPr>
+        <w:spacing w:line="360" w:after="120"/>
+        <w:jc w:val="both"/>
+      </w:pPr>
+      <w:r>
+        <w:rPr>
+          <w:b/>
+          <w:bCs/>
+          <w:color w:val="008000"/>
+          <w:sz w:val="24"/>
+          <w:szCs w:val="24"/>
+          <w:rFonts w:ascii="Times New Roman" w:cs="Times New Roman" w:eastAsia="Times New Roman" w:hAnsi="Times New Roman"/>
+        </w:rPr>
+        <w:t xml:space="preserve">[COMPLETAR — escenario de sobreuso simulado (equipo empujado sobre umbral desde /prueba), verificación del cálculo del indicador HAM, disparo de la alerta AMP al 80% del umbral (validación visual filmada), y demostración del cálculo del MTBF con fallas sintéticas (declaradas como tales, ver regla de honestidad).]</w:t>
+      </w:r>
+    </w:p>
+    <w:p>
+      <w:pPr>
+        <w:pStyle w:val="Heading3"/>
+        <w:spacing w:before="240" w:after="120"/>
+      </w:pPr>
+      <w:r>
+        <w:rPr>
+          <w:b/>
+          <w:bCs/>
+          <w:sz w:val="28"/>
+          <w:szCs w:val="28"/>
+          <w:rFonts w:ascii="Times New Roman" w:cs="Times New Roman" w:eastAsia="Times New Roman" w:hAnsi="Times New Roman"/>
+        </w:rPr>
+        <w:t xml:space="preserve">Tabla resumen de resultados</w:t>
+      </w:r>
+    </w:p>
+    <w:p>
+      <w:pPr>
+        <w:spacing w:line="360" w:after="120"/>
+        <w:jc w:val="both"/>
+      </w:pPr>
+      <w:r>
+        <w:rPr>
+          <w:b/>
+          <w:bCs/>
+          <w:color w:val="008000"/>
+          <w:sz w:val="24"/>
+          <w:szCs w:val="24"/>
+          <w:rFonts w:ascii="Times New Roman" w:cs="Times New Roman" w:eastAsia="Times New Roman" w:hAnsi="Times New Roman"/>
+        </w:rPr>
+        <w:t xml:space="preserve">[COMPLETAR — tabla con columnas: indicador / valor esperado / valor obtenido / observación.]</w:t>
       </w:r>
     </w:p>
     <w:p>
@@ -3947,11 +4121,14 @@
       </w:pPr>
       <w:r>
         <w:rPr>
-          <w:sz w:val="24"/>
-          <w:szCs w:val="24"/>
-          <w:rFonts w:ascii="Times New Roman" w:cs="Times New Roman" w:eastAsia="Times New Roman" w:hAnsi="Times New Roman"/>
-        </w:rPr>
-        <w:t xml:space="preserve">La prueba de concepto aportará evidencia empírica adicional sobre esta dimensión, a partir de los resultados que se obtengan en las etapas 2 y 3 del protocolo (ver 4.4 y 5.5).</w:t>
+          <w:b/>
+          <w:bCs/>
+          <w:color w:val="008000"/>
+          <w:sz w:val="24"/>
+          <w:szCs w:val="24"/>
+          <w:rFonts w:ascii="Times New Roman" w:cs="Times New Roman" w:eastAsia="Times New Roman" w:hAnsi="Times New Roman"/>
+        </w:rPr>
+        <w:t xml:space="preserve">[COMPLETAR — confirmar, a partir de los resultados de las etapas 2 y 3, la tasa de lectura del QR obtenida y la tolerancia a cortes de red medida.]</w:t>
       </w:r>
     </w:p>
     <w:p>
@@ -4915,11 +5092,14 @@
       </w:pPr>
       <w:r>
         <w:rPr>
-          <w:sz w:val="24"/>
-          <w:szCs w:val="24"/>
-          <w:rFonts w:ascii="Times New Roman" w:cs="Times New Roman" w:eastAsia="Times New Roman" w:hAnsi="Times New Roman"/>
-        </w:rPr>
-        <w:t xml:space="preserve">La interpretación de los resultados de la prueba de concepto a la luz de los objetivos planteados —el grado en que confirman la robustez de la infraestructura de datos y su relación con los antecedentes de la literatura citados en el marco teórico— se desarrolla en este apartado una vez finalizada la ejecución del protocolo descripto en 4.4.</w:t>
+          <w:b/>
+          <w:bCs/>
+          <w:color w:val="008000"/>
+          <w:sz w:val="24"/>
+          <w:szCs w:val="24"/>
+          <w:rFonts w:ascii="Times New Roman" w:cs="Times New Roman" w:eastAsia="Times New Roman" w:hAnsi="Times New Roman"/>
+        </w:rPr>
+        <w:t xml:space="preserve">[COMPLETAR — interpretación de los resultados de la prueba de concepto a la luz de los objetivos. Discutir en qué medida los resultados confirman la robustez de la infraestructura de datos, comparar los valores obtenidos con los esperados según el escenario de referencia SATI-Q, y relacionarlos con los precedentes de la literatura (ECLIPSE, Ma 2021, Alshamasneh 2021).]</w:t>
       </w:r>
     </w:p>
     <w:p>
@@ -5054,11 +5234,14 @@
       </w:pPr>
       <w:r>
         <w:rPr>
-          <w:sz w:val="24"/>
-          <w:szCs w:val="24"/>
-          <w:rFonts w:ascii="Times New Roman" w:cs="Times New Roman" w:eastAsia="Times New Roman" w:hAnsi="Times New Roman"/>
-        </w:rPr>
-        <w:t xml:space="preserve">•	La conclusión sobre el grado de validación de la robustez técnica de la infraestructura de datos —captura, red y persistencia, exactitud de la acumulación de horas y disparo de alertas— se incorpora a este apartado una vez finalizada la prueba de concepto.</w:t>
+          <w:b/>
+          <w:bCs/>
+          <w:color w:val="008000"/>
+          <w:sz w:val="24"/>
+          <w:szCs w:val="24"/>
+          <w:rFonts w:ascii="Times New Roman" w:cs="Times New Roman" w:eastAsia="Times New Roman" w:hAnsi="Times New Roman"/>
+        </w:rPr>
+        <w:t xml:space="preserve">•	[COMPLETAR — conclusión sobre los resultados de la prueba de concepto: en qué medida se validó la robustez técnica de la infraestructura de datos (captura por QR, tolerancia a red/persistencia, exactitud de acumulación y disparo de alertas), con las cifras cuantitativas resumen.]</w:t>
       </w:r>
     </w:p>
     <w:p>
@@ -5623,11 +5806,14 @@
       </w:pPr>
       <w:r>
         <w:rPr>
-          <w:sz w:val="24"/>
-          <w:szCs w:val="24"/>
-          <w:rFonts w:ascii="Times New Roman" w:cs="Times New Roman" w:eastAsia="Times New Roman" w:hAnsi="Times New Roman"/>
-        </w:rPr>
-        <w:t xml:space="preserve">El protocolo detallado efectivamente ejecutado —listado de “gemelos” y sus QR, cronograma del protocolo de carga, planilla de registro de escaneos, escenarios de corte de red y de stress, y planilla de resultados por etapa— se incorpora a este anexo al finalizar la prueba de concepto.</w:t>
+          <w:b/>
+          <w:bCs/>
+          <w:color w:val="008000"/>
+          <w:sz w:val="24"/>
+          <w:szCs w:val="24"/>
+          <w:rFonts w:ascii="Times New Roman" w:cs="Times New Roman" w:eastAsia="Times New Roman" w:hAnsi="Times New Roman"/>
+        </w:rPr>
+        <w:t xml:space="preserve">[COMPLETAR — protocolo detallado efectivamente ejecutado: lista de gemelos y sus QR, cronograma de carga (referenciar cronograma.md), planilla de registro de escaneos completada (planilla-registro.csv), escenarios de corte de red y de stress ejecutados, y planilla de resultados por etapa.]</w:t>
       </w:r>
     </w:p>
     <w:sectPr>

</xml_diff>